<commit_message>
Incorpora los temas de introducción y estructura BPM verificados
</commit_message>
<xml_diff>
--- a/Proyecto_Educativo/Matriz_temas.docx
+++ b/Proyecto_Educativo/Matriz_temas.docx
@@ -7,12 +7,12 @@
         <w:pStyle w:val="Title"/>
       </w:pPr>
       <w:r>
-        <w:t>Plan de producción educativa</w:t>
+        <w:t>Dos materias · 27 subtemas</w:t>
       </w:r>
     </w:p>
     <w:p>
       <w:r>
-        <w:t>27 subtemas · 2 materias · 5 entregables por subtema seleccionado. Asignación individual pendiente. Piloto propuesto: NE 1.1. Las páginas de inicio.</w:t>
+        <w:t>135 entregables principales. Alcance: todos los contenidos numerados de los dos sílabos. Las actividades de Educaplay se entregan preparadas para publicar desde una cuenta autorizada.</w:t>
       </w:r>
     </w:p>
     <w:p>
@@ -25,7 +25,7 @@
     </w:p>
     <w:p>
       <w:r>
-        <w:t>E-CA-LND-202 · Nivel 4 · 120 horas · Período 2026–2027</w:t>
+        <w:t>E-CA-LND-202 · Nivel 4 · 120 horas · 2026–2027</w:t>
       </w:r>
     </w:p>
     <w:p>
@@ -73,7 +73,7 @@
               <w:rPr>
                 <w:sz w:val="18"/>
               </w:rPr>
-              <w:t>Tema</w:t>
+              <w:t>Subtema</w:t>
             </w:r>
           </w:p>
         </w:tc>
@@ -86,7 +86,7 @@
               <w:rPr>
                 <w:sz w:val="18"/>
               </w:rPr>
-              <w:t>Entregables necesarios</w:t>
+              <w:t>Materiales</w:t>
             </w:r>
           </w:p>
         </w:tc>
@@ -130,7 +130,7 @@
               <w:rPr>
                 <w:sz w:val="18"/>
               </w:rPr>
-              <w:t>PPTX, MP4, MP3, DOCX y Educaplay</w:t>
+              <w:t>PPTX · MP4 · MP3 · DOCX · Actividad</w:t>
             </w:r>
           </w:p>
         </w:tc>
@@ -174,7 +174,7 @@
               <w:rPr>
                 <w:sz w:val="18"/>
               </w:rPr>
-              <w:t>PPTX, MP4, MP3, DOCX y Educaplay</w:t>
+              <w:t>PPTX · MP4 · MP3 · DOCX · Actividad</w:t>
             </w:r>
           </w:p>
         </w:tc>
@@ -218,7 +218,7 @@
               <w:rPr>
                 <w:sz w:val="18"/>
               </w:rPr>
-              <w:t>PPTX, MP4, MP3, DOCX y Educaplay</w:t>
+              <w:t>PPTX · MP4 · MP3 · DOCX · Actividad</w:t>
             </w:r>
           </w:p>
         </w:tc>
@@ -262,7 +262,7 @@
               <w:rPr>
                 <w:sz w:val="18"/>
               </w:rPr>
-              <w:t>PPTX, MP4, MP3, DOCX y Educaplay</w:t>
+              <w:t>PPTX · MP4 · MP3 · DOCX · Actividad</w:t>
             </w:r>
           </w:p>
         </w:tc>
@@ -313,7 +313,7 @@
               <w:rPr>
                 <w:sz w:val="18"/>
               </w:rPr>
-              <w:t>Tema</w:t>
+              <w:t>Subtema</w:t>
             </w:r>
           </w:p>
         </w:tc>
@@ -326,7 +326,7 @@
               <w:rPr>
                 <w:sz w:val="18"/>
               </w:rPr>
-              <w:t>Entregables necesarios</w:t>
+              <w:t>Materiales</w:t>
             </w:r>
           </w:p>
         </w:tc>
@@ -370,7 +370,7 @@
               <w:rPr>
                 <w:sz w:val="18"/>
               </w:rPr>
-              <w:t>PPTX, MP4, MP3, DOCX y Educaplay</w:t>
+              <w:t>PPTX · MP4 · MP3 · DOCX · Actividad</w:t>
             </w:r>
           </w:p>
         </w:tc>
@@ -414,7 +414,7 @@
               <w:rPr>
                 <w:sz w:val="18"/>
               </w:rPr>
-              <w:t>PPTX, MP4, MP3, DOCX y Educaplay</w:t>
+              <w:t>PPTX · MP4 · MP3 · DOCX · Actividad</w:t>
             </w:r>
           </w:p>
         </w:tc>
@@ -465,7 +465,7 @@
               <w:rPr>
                 <w:sz w:val="18"/>
               </w:rPr>
-              <w:t>Tema</w:t>
+              <w:t>Subtema</w:t>
             </w:r>
           </w:p>
         </w:tc>
@@ -478,7 +478,7 @@
               <w:rPr>
                 <w:sz w:val="18"/>
               </w:rPr>
-              <w:t>Entregables necesarios</w:t>
+              <w:t>Materiales</w:t>
             </w:r>
           </w:p>
         </w:tc>
@@ -522,7 +522,7 @@
               <w:rPr>
                 <w:sz w:val="18"/>
               </w:rPr>
-              <w:t>PPTX, MP4, MP3, DOCX y Educaplay</w:t>
+              <w:t>PPTX · MP4 · MP3 · DOCX · Actividad</w:t>
             </w:r>
           </w:p>
         </w:tc>
@@ -566,7 +566,7 @@
               <w:rPr>
                 <w:sz w:val="18"/>
               </w:rPr>
-              <w:t>PPTX, MP4, MP3, DOCX y Educaplay</w:t>
+              <w:t>PPTX · MP4 · MP3 · DOCX · Actividad</w:t>
             </w:r>
           </w:p>
         </w:tc>
@@ -610,7 +610,7 @@
               <w:rPr>
                 <w:sz w:val="18"/>
               </w:rPr>
-              <w:t>PPTX, MP4, MP3, DOCX y Educaplay</w:t>
+              <w:t>PPTX · MP4 · MP3 · DOCX · Actividad</w:t>
             </w:r>
           </w:p>
         </w:tc>
@@ -654,7 +654,7 @@
               <w:rPr>
                 <w:sz w:val="18"/>
               </w:rPr>
-              <w:t>PPTX, MP4, MP3, DOCX y Educaplay</w:t>
+              <w:t>PPTX · MP4 · MP3 · DOCX · Actividad</w:t>
             </w:r>
           </w:p>
         </w:tc>
@@ -705,7 +705,7 @@
               <w:rPr>
                 <w:sz w:val="18"/>
               </w:rPr>
-              <w:t>Tema</w:t>
+              <w:t>Subtema</w:t>
             </w:r>
           </w:p>
         </w:tc>
@@ -718,7 +718,7 @@
               <w:rPr>
                 <w:sz w:val="18"/>
               </w:rPr>
-              <w:t>Entregables necesarios</w:t>
+              <w:t>Materiales</w:t>
             </w:r>
           </w:p>
         </w:tc>
@@ -762,7 +762,7 @@
               <w:rPr>
                 <w:sz w:val="18"/>
               </w:rPr>
-              <w:t>PPTX, MP4, MP3, DOCX y Educaplay</w:t>
+              <w:t>PPTX · MP4 · MP3 · DOCX · Actividad</w:t>
             </w:r>
           </w:p>
         </w:tc>
@@ -806,7 +806,7 @@
               <w:rPr>
                 <w:sz w:val="18"/>
               </w:rPr>
-              <w:t>PPTX, MP4, MP3, DOCX y Educaplay</w:t>
+              <w:t>PPTX · MP4 · MP3 · DOCX · Actividad</w:t>
             </w:r>
           </w:p>
         </w:tc>
@@ -822,7 +822,7 @@
     </w:p>
     <w:p>
       <w:r>
-        <w:t>E-CA-LND-214 · Nivel 8 · 160 horas · Período 2026–2027</w:t>
+        <w:t>E-CA-LND-214 · Nivel 8 · 160 horas · 2026–2027</w:t>
       </w:r>
     </w:p>
     <w:p>
@@ -870,7 +870,7 @@
               <w:rPr>
                 <w:sz w:val="18"/>
               </w:rPr>
-              <w:t>Tema</w:t>
+              <w:t>Subtema</w:t>
             </w:r>
           </w:p>
         </w:tc>
@@ -883,7 +883,7 @@
               <w:rPr>
                 <w:sz w:val="18"/>
               </w:rPr>
-              <w:t>Entregables necesarios</w:t>
+              <w:t>Materiales</w:t>
             </w:r>
           </w:p>
         </w:tc>
@@ -927,7 +927,7 @@
               <w:rPr>
                 <w:sz w:val="18"/>
               </w:rPr>
-              <w:t>PPTX, MP4, MP3, DOCX y Educaplay</w:t>
+              <w:t>PPTX · MP4 · MP3 · DOCX · Actividad</w:t>
             </w:r>
           </w:p>
         </w:tc>
@@ -971,7 +971,7 @@
               <w:rPr>
                 <w:sz w:val="18"/>
               </w:rPr>
-              <w:t>PPTX, MP4, MP3, DOCX y Educaplay</w:t>
+              <w:t>PPTX · MP4 · MP3 · DOCX · Actividad</w:t>
             </w:r>
           </w:p>
         </w:tc>
@@ -1015,7 +1015,7 @@
               <w:rPr>
                 <w:sz w:val="18"/>
               </w:rPr>
-              <w:t>PPTX, MP4, MP3, DOCX y Educaplay</w:t>
+              <w:t>PPTX · MP4 · MP3 · DOCX · Actividad</w:t>
             </w:r>
           </w:p>
         </w:tc>
@@ -1059,7 +1059,7 @@
               <w:rPr>
                 <w:sz w:val="18"/>
               </w:rPr>
-              <w:t>PPTX, MP4, MP3, DOCX y Educaplay</w:t>
+              <w:t>PPTX · MP4 · MP3 · DOCX · Actividad</w:t>
             </w:r>
           </w:p>
         </w:tc>
@@ -1110,7 +1110,7 @@
               <w:rPr>
                 <w:sz w:val="18"/>
               </w:rPr>
-              <w:t>Tema</w:t>
+              <w:t>Subtema</w:t>
             </w:r>
           </w:p>
         </w:tc>
@@ -1123,7 +1123,7 @@
               <w:rPr>
                 <w:sz w:val="18"/>
               </w:rPr>
-              <w:t>Entregables necesarios</w:t>
+              <w:t>Materiales</w:t>
             </w:r>
           </w:p>
         </w:tc>
@@ -1167,7 +1167,7 @@
               <w:rPr>
                 <w:sz w:val="18"/>
               </w:rPr>
-              <w:t>PPTX, MP4, MP3, DOCX y Educaplay</w:t>
+              <w:t>PPTX · MP4 · MP3 · DOCX · Actividad</w:t>
             </w:r>
           </w:p>
         </w:tc>
@@ -1211,7 +1211,7 @@
               <w:rPr>
                 <w:sz w:val="18"/>
               </w:rPr>
-              <w:t>PPTX, MP4, MP3, DOCX y Educaplay</w:t>
+              <w:t>PPTX · MP4 · MP3 · DOCX · Actividad</w:t>
             </w:r>
           </w:p>
         </w:tc>
@@ -1255,7 +1255,7 @@
               <w:rPr>
                 <w:sz w:val="18"/>
               </w:rPr>
-              <w:t>PPTX, MP4, MP3, DOCX y Educaplay</w:t>
+              <w:t>PPTX · MP4 · MP3 · DOCX · Actividad</w:t>
             </w:r>
           </w:p>
         </w:tc>
@@ -1306,7 +1306,7 @@
               <w:rPr>
                 <w:sz w:val="18"/>
               </w:rPr>
-              <w:t>Tema</w:t>
+              <w:t>Subtema</w:t>
             </w:r>
           </w:p>
         </w:tc>
@@ -1319,7 +1319,7 @@
               <w:rPr>
                 <w:sz w:val="18"/>
               </w:rPr>
-              <w:t>Entregables necesarios</w:t>
+              <w:t>Materiales</w:t>
             </w:r>
           </w:p>
         </w:tc>
@@ -1363,7 +1363,7 @@
               <w:rPr>
                 <w:sz w:val="18"/>
               </w:rPr>
-              <w:t>PPTX, MP4, MP3, DOCX y Educaplay</w:t>
+              <w:t>PPTX · MP4 · MP3 · DOCX · Actividad</w:t>
             </w:r>
           </w:p>
         </w:tc>
@@ -1407,7 +1407,7 @@
               <w:rPr>
                 <w:sz w:val="18"/>
               </w:rPr>
-              <w:t>PPTX, MP4, MP3, DOCX y Educaplay</w:t>
+              <w:t>PPTX · MP4 · MP3 · DOCX · Actividad</w:t>
             </w:r>
           </w:p>
         </w:tc>
@@ -1451,7 +1451,7 @@
               <w:rPr>
                 <w:sz w:val="18"/>
               </w:rPr>
-              <w:t>PPTX, MP4, MP3, DOCX y Educaplay</w:t>
+              <w:t>PPTX · MP4 · MP3 · DOCX · Actividad</w:t>
             </w:r>
           </w:p>
         </w:tc>
@@ -1495,7 +1495,7 @@
               <w:rPr>
                 <w:sz w:val="18"/>
               </w:rPr>
-              <w:t>PPTX, MP4, MP3, DOCX y Educaplay</w:t>
+              <w:t>PPTX · MP4 · MP3 · DOCX · Actividad</w:t>
             </w:r>
           </w:p>
         </w:tc>
@@ -1546,7 +1546,7 @@
               <w:rPr>
                 <w:sz w:val="18"/>
               </w:rPr>
-              <w:t>Tema</w:t>
+              <w:t>Subtema</w:t>
             </w:r>
           </w:p>
         </w:tc>
@@ -1559,7 +1559,7 @@
               <w:rPr>
                 <w:sz w:val="18"/>
               </w:rPr>
-              <w:t>Entregables necesarios</w:t>
+              <w:t>Materiales</w:t>
             </w:r>
           </w:p>
         </w:tc>
@@ -1603,7 +1603,7 @@
               <w:rPr>
                 <w:sz w:val="18"/>
               </w:rPr>
-              <w:t>PPTX, MP4, MP3, DOCX y Educaplay</w:t>
+              <w:t>PPTX · MP4 · MP3 · DOCX · Actividad</w:t>
             </w:r>
           </w:p>
         </w:tc>
@@ -1647,7 +1647,7 @@
               <w:rPr>
                 <w:sz w:val="18"/>
               </w:rPr>
-              <w:t>PPTX, MP4, MP3, DOCX y Educaplay</w:t>
+              <w:t>PPTX · MP4 · MP3 · DOCX · Actividad</w:t>
             </w:r>
           </w:p>
         </w:tc>
@@ -1691,7 +1691,7 @@
               <w:rPr>
                 <w:sz w:val="18"/>
               </w:rPr>
-              <w:t>PPTX, MP4, MP3, DOCX y Educaplay</w:t>
+              <w:t>PPTX · MP4 · MP3 · DOCX · Actividad</w:t>
             </w:r>
           </w:p>
         </w:tc>
@@ -1735,7 +1735,7 @@
               <w:rPr>
                 <w:sz w:val="18"/>
               </w:rPr>
-              <w:t>PPTX, MP4, MP3, DOCX y Educaplay</w:t>
+              <w:t>PPTX · MP4 · MP3 · DOCX · Actividad</w:t>
             </w:r>
           </w:p>
         </w:tc>
@@ -1743,7 +1743,7 @@
     </w:tbl>
     <w:p>
       <w:r>
-        <w:t>Fuente: página 1 de cada sílabo adjunto. Ver Analisis_silabos.md para resultados de aprendizaje, actividades oficiales y alcance. No se omiten temas de la matriz; solo el piloto está desarrollado.</w:t>
+        <w:t>Base: página 1 de los dos sílabos adjuntos. La producción educativa no reemplaza la planificación ni las rúbricas oficiales del profesor. El análisis ampliado y las referencias están en los archivos de esta colección.</w:t>
       </w:r>
     </w:p>
     <w:sectPr>
@@ -1779,7 +1779,7 @@
       <w:pStyle w:val="Caption"/>
     </w:pPr>
     <w:r>
-      <w:t>NEGOCIOS ELECTRÓNICOS  /  UNIDAD 1  /  TEMA 1.1</w:t>
+      <w:t>PROYECTO EDUCATIVO / COBERTURA CURRICULAR COMPLETA</w:t>
     </w:r>
   </w:p>
 </w:hdr>

</xml_diff>